<commit_message>
updated the resume and dates on articles
</commit_message>
<xml_diff>
--- a/public/material/thanos-vassilakis-resume.docx
+++ b/public/material/thanos-vassilakis-resume.docx
@@ -51,7 +51,7 @@
         </w:rPr>
         <w:t xml:space="preserve"> </w:t>
       </w:r>
-      <w:hyperlink w:history="1" r:id="rIdhupoqqlot0emespspeinv">
+      <w:hyperlink w:history="1" r:id="rIdbcru5ngvilrbxtxol7ud3">
         <w:r>
           <w:rPr>
             <w:rFonts w:ascii="Palatino Linotype" w:cs="Palatino Linotype" w:eastAsia="Palatino Linotype" w:hAnsi="Palatino Linotype"/>
@@ -130,7 +130,7 @@
         </w:rPr>
         <w:t xml:space="preserve"> </w:t>
       </w:r>
-      <w:hyperlink w:history="1" r:id="rId-kqrjuni3zyapky7madxq">
+      <w:hyperlink w:history="1" r:id="rIdhyacgqhdlttvjiiiwgsaz">
         <w:r>
           <w:rPr>
             <w:rFonts w:ascii="Palatino Linotype" w:cs="Palatino Linotype" w:eastAsia="Palatino Linotype" w:hAnsi="Palatino Linotype"/>
@@ -185,7 +185,7 @@
       <w:pPr>
         <w:spacing w:after="80" w:before="0" w:line="331" w:lineRule="auto"/>
       </w:pPr>
-      <w:hyperlink w:history="1" r:id="rIdt667juux0k0hcyuwq2bgn">
+      <w:hyperlink w:history="1" r:id="rId-onbsuovayegon0-i7wms">
         <w:r>
           <w:rPr>
             <w:rFonts w:ascii="Palatino Linotype" w:cs="Palatino Linotype" w:eastAsia="Palatino Linotype" w:hAnsi="Palatino Linotype"/>
@@ -2443,7 +2443,7 @@
                 <w:sz w:val="19"/>
                 <w:szCs w:val="19"/>
               </w:rPr>
-              <w:t xml:space="preserve">MapQuest Mobile and eBay's first mobile app</w:t>
+              <w:t xml:space="preserve">including MapQuest, eBay, NBC Weather, New York Times</w:t>
             </w:r>
           </w:p>
         </w:tc>
@@ -4423,7 +4423,7 @@
         </w:rPr>
         <w:t xml:space="preserve"> </w:t>
       </w:r>
-      <w:hyperlink w:history="1" r:id="rIdvcqwl2zcwulkpm-rg9b3a">
+      <w:hyperlink w:history="1" r:id="rIdv86zhdmlv4zm6egbktzir">
         <w:r>
           <w:rPr>
             <w:rFonts w:ascii="Palatino Linotype" w:cs="Palatino Linotype" w:eastAsia="Palatino Linotype" w:hAnsi="Palatino Linotype"/>

</xml_diff>